<commit_message>
Refine FSD report: cantSplit on table rows, remove redundant break, dual save
</commit_message>
<xml_diff>
--- a/docs/URL_Shortner_Simulater_FSD_Report.docx
+++ b/docs/URL_Shortner_Simulater_FSD_Report.docx
@@ -85,11 +85,6 @@
         <w:br/>
         <w:t>MLR Institute of Technology &amp; Management (MLRITM)</w:t>
         <w:br/>
-      </w:r>
-    </w:p>
-    <w:p>
-      <w:r>
-        <w:br w:type="page"/>
       </w:r>
     </w:p>
     <w:p>
@@ -1421,6 +1416,9 @@
         <w:gridCol w:w="1872"/>
       </w:tblGrid>
       <w:tr>
+        <w:trPr>
+          <w:cantSplit/>
+        </w:trPr>
         <w:tc>
           <w:tcPr>
             <w:tcW w:type="dxa" w:w="1872"/>
@@ -1538,6 +1536,9 @@
         </w:tc>
       </w:tr>
       <w:tr>
+        <w:trPr>
+          <w:cantSplit/>
+        </w:trPr>
         <w:tc>
           <w:tcPr>
             <w:tcW w:type="dxa" w:w="1872"/>
@@ -1638,7 +1639,6 @@
               <w:rPr>
                 <w:rFonts w:ascii="Calibri" w:hAnsi="Calibri"/>
                 <w:b/>
-                <w:color w:val="10B981"/>
                 <w:sz w:val="19"/>
               </w:rPr>
               <w:t>PASS</w:t>
@@ -1647,6 +1647,9 @@
         </w:tc>
       </w:tr>
       <w:tr>
+        <w:trPr>
+          <w:cantSplit/>
+        </w:trPr>
         <w:tc>
           <w:tcPr>
             <w:tcW w:type="dxa" w:w="1872"/>
@@ -1747,7 +1750,6 @@
               <w:rPr>
                 <w:rFonts w:ascii="Calibri" w:hAnsi="Calibri"/>
                 <w:b/>
-                <w:color w:val="10B981"/>
                 <w:sz w:val="19"/>
               </w:rPr>
               <w:t>PASS</w:t>
@@ -1756,6 +1758,9 @@
         </w:tc>
       </w:tr>
       <w:tr>
+        <w:trPr>
+          <w:cantSplit/>
+        </w:trPr>
         <w:tc>
           <w:tcPr>
             <w:tcW w:type="dxa" w:w="1872"/>
@@ -1856,7 +1861,6 @@
               <w:rPr>
                 <w:rFonts w:ascii="Calibri" w:hAnsi="Calibri"/>
                 <w:b/>
-                <w:color w:val="10B981"/>
                 <w:sz w:val="19"/>
               </w:rPr>
               <w:t>PASS</w:t>
@@ -1865,6 +1869,9 @@
         </w:tc>
       </w:tr>
       <w:tr>
+        <w:trPr>
+          <w:cantSplit/>
+        </w:trPr>
         <w:tc>
           <w:tcPr>
             <w:tcW w:type="dxa" w:w="1872"/>
@@ -1965,7 +1972,6 @@
               <w:rPr>
                 <w:rFonts w:ascii="Calibri" w:hAnsi="Calibri"/>
                 <w:b/>
-                <w:color w:val="10B981"/>
                 <w:sz w:val="19"/>
               </w:rPr>
               <w:t>PASS</w:t>
@@ -1974,6 +1980,9 @@
         </w:tc>
       </w:tr>
       <w:tr>
+        <w:trPr>
+          <w:cantSplit/>
+        </w:trPr>
         <w:tc>
           <w:tcPr>
             <w:tcW w:type="dxa" w:w="1872"/>
@@ -2074,7 +2083,6 @@
               <w:rPr>
                 <w:rFonts w:ascii="Calibri" w:hAnsi="Calibri"/>
                 <w:b/>
-                <w:color w:val="10B981"/>
                 <w:sz w:val="19"/>
               </w:rPr>
               <w:t>PASS</w:t>

</xml_diff>